<commit_message>
Richer data; case B is released during the session
</commit_message>
<xml_diff>
--- a/breakout/challenge-1-price-memo/BRIEF.docx
+++ b/breakout/challenge-1-price-memo/BRIEF.docx
@@ -31,7 +31,7 @@
     </w:p>
     <w:p>
       <w:r>
-        <w:t>Your client Alvora sells PlanPilot, a project-management tool for mid-sized companies. The CEO asks: "Are we priced right against the competition?" She wants a one-page memo with a clear recommendation.</w:t>
+        <w:t>Your client Alvora sells PlanPilot, a project-management tool for mid-sized companies. The CEO asks: "Are we priced right against the competition?" She wants a one-page memo with a clear recommendation. The data from sales and from the product has more in it than the sales team's opinions.</w:t>
       </w:r>
     </w:p>
     <w:p>
@@ -182,7 +182,7 @@
           <w:p>
             <w:r/>
             <w:r>
-              <w:t>Pull the facts that matter for the price question out of the data.</w:t>
+              <w:t>Analyze the data and pull out the facts that matter for the price question.</w:t>
             </w:r>
           </w:p>
         </w:tc>
@@ -410,28 +410,75 @@
         <w:rPr>
           <w:b/>
         </w:rPr>
-        <w:t>Case A:</w:t>
+        <w:t>Case A, the Pro plan.</w:t>
       </w:r>
       <w:r>
-        <w:t xml:space="preserve"> the Pro plan. Data: </w:t>
+        <w:t xml:space="preserve"> Data in </w:t>
       </w:r>
       <w:r>
         <w:rPr>
           <w:rFonts w:ascii="Courier New" w:hAnsi="Courier New"/>
         </w:rPr>
-        <w:t>data/product-pro.md</w:t>
+        <w:t>data/</w:t>
       </w:r>
       <w:r>
-        <w:t xml:space="preserve"> and </w:t>
+        <w:t>:</w:t>
+      </w:r>
+    </w:p>
+    <w:p>
+      <w:r>
+        <w:t xml:space="preserve">  - </w:t>
       </w:r>
       <w:r>
         <w:rPr>
           <w:rFonts w:ascii="Courier New" w:hAnsi="Courier New"/>
         </w:rPr>
-        <w:t>data/competitors.csv</w:t>
+        <w:t>product-pro.md</w:t>
       </w:r>
       <w:r>
-        <w:t>.</w:t>
+        <w:t>: the product, the price and notes from sales</w:t>
+      </w:r>
+    </w:p>
+    <w:p>
+      <w:r>
+        <w:t xml:space="preserve">  - </w:t>
+      </w:r>
+      <w:r>
+        <w:rPr>
+          <w:rFonts w:ascii="Courier New" w:hAnsi="Courier New"/>
+        </w:rPr>
+        <w:t>competitors.csv</w:t>
+      </w:r>
+      <w:r>
+        <w:t>: 16 competitor plans</w:t>
+      </w:r>
+    </w:p>
+    <w:p>
+      <w:r>
+        <w:t xml:space="preserve">  - </w:t>
+      </w:r>
+      <w:r>
+        <w:rPr>
+          <w:rFonts w:ascii="Courier New" w:hAnsi="Courier New"/>
+        </w:rPr>
+        <w:t>deals.csv</w:t>
+      </w:r>
+      <w:r>
+        <w:t>: 200 won and lost deals from the last 12 months</w:t>
+      </w:r>
+    </w:p>
+    <w:p>
+      <w:r>
+        <w:t xml:space="preserve">  - </w:t>
+      </w:r>
+      <w:r>
+        <w:rPr>
+          <w:rFonts w:ascii="Courier New" w:hAnsi="Courier New"/>
+        </w:rPr>
+        <w:t>usage.csv</w:t>
+      </w:r>
+      <w:r>
+        <w:t>: 180 customers, paid users against active users</w:t>
       </w:r>
     </w:p>
     <w:p>
@@ -442,28 +489,10 @@
         <w:rPr>
           <w:b/>
         </w:rPr>
-        <w:t>Case B:</w:t>
+        <w:t>Case B, a planned Enterprise plan.</w:t>
       </w:r>
       <w:r>
-        <w:t xml:space="preserve"> a planned Enterprise plan. Data: </w:t>
-      </w:r>
-      <w:r>
-        <w:rPr>
-          <w:rFonts w:ascii="Courier New" w:hAnsi="Courier New"/>
-        </w:rPr>
-        <w:t>data/product-enterprise.md</w:t>
-      </w:r>
-      <w:r>
-        <w:t xml:space="preserve"> and </w:t>
-      </w:r>
-      <w:r>
-        <w:rPr>
-          <w:rFonts w:ascii="Courier New" w:hAnsi="Courier New"/>
-        </w:rPr>
-        <w:t>data/competitors.csv</w:t>
-      </w:r>
-      <w:r>
-        <w:t>.</w:t>
+        <w:t xml:space="preserve"> Arrives in your Teams chat at minute 30. Run your improved chain on it without changing the instructions first.</w:t>
       </w:r>
     </w:p>
     <w:p>
@@ -495,7 +524,7 @@
         <w:pStyle w:val="ListBullet"/>
       </w:pPr>
       <w:r>
-        <w:t>The reasoning can be followed in two minutes.</w:t>
+        <w:t>The memo uses what the deals and the usage show, not only what sales says.</w:t>
       </w:r>
     </w:p>
     <w:p>

</xml_diff>

<commit_message>
Final exam for the hands-on; case B ships in each challenge folder
</commit_message>
<xml_diff>
--- a/breakout/challenge-1-price-memo/BRIEF.docx
+++ b/breakout/challenge-1-price-memo/BRIEF.docx
@@ -492,7 +492,25 @@
         <w:t>Case B, a planned Enterprise plan.</w:t>
       </w:r>
       <w:r>
-        <w:t xml:space="preserve"> Arrives in your Teams chat at minute 30. Run your improved chain on it without changing the instructions first.</w:t>
+        <w:t xml:space="preserve"> In the folder </w:t>
+      </w:r>
+      <w:r>
+        <w:rPr>
+          <w:rFonts w:ascii="Courier New" w:hAnsi="Courier New"/>
+        </w:rPr>
+        <w:t>case-b/</w:t>
+      </w:r>
+      <w:r>
+        <w:t xml:space="preserve">. </w:t>
+      </w:r>
+      <w:r>
+        <w:rPr>
+          <w:b/>
+        </w:rPr>
+        <w:t>Open it only at minute 30.</w:t>
+      </w:r>
+      <w:r>
+        <w:t xml:space="preserve"> Run your improved chain on it without changing the instructions first.</w:t>
       </w:r>
     </w:p>
     <w:p>

</xml_diff>